<commit_message>
Add acreage/linear ft to practice implementation plans #60
</commit_message>
<xml_diff>
--- a/templates/rcp-template.docx
+++ b/templates/rcp-template.docx
@@ -1074,6 +1074,23 @@
       <w:r>
         <w:rPr/>
         <w:t xml:space="preserve"> ${practice_name}</w:t>
+      </w:r>
+    </w:p>
+    <w:p>
+      <w:pPr>
+        <w:pStyle w:val="TextBody"/>
+        <w:rPr/>
+      </w:pPr>
+      <w:r>
+        <w:rPr>
+          <w:b/>
+          <w:bCs/>
+        </w:rPr>
+        <w:t>Measurement:</w:t>
+      </w:r>
+      <w:r>
+        <w:rPr/>
+        <w:t xml:space="preserve"> ${practice_measurement}</w:t>
       </w:r>
     </w:p>
     <w:p>

</xml_diff>

<commit_message>
Fix logo placeholder replacement.
The logo placeholder may contain size information (eg: ${logo:300x100})
which does not get removed by a simple setValue('logo', ''). So we
wrap it in a logo_block and then clone that zero times (because
apparently deleteBlock() and replaceBlock() don't work anymore).

See: https://github.com/PHPOffice/PHPWord/issues/341#issuecomment-557939060
</commit_message>
<xml_diff>
--- a/templates/rcp-template.docx
+++ b/templates/rcp-template.docx
@@ -14,7 +14,37 @@
       </w:pPr>
       <w:r>
         <w:rPr/>
+        <w:t>${logo_block}</w:t>
+      </w:r>
+    </w:p>
+    <w:p>
+      <w:pPr>
+        <w:pStyle w:val="Normal"/>
+        <w:numPr>
+          <w:ilvl w:val="0"/>
+          <w:numId w:val="1"/>
+        </w:numPr>
+        <w:jc w:val="center"/>
+        <w:rPr/>
+      </w:pPr>
+      <w:r>
+        <w:rPr/>
         <w:t>${logo:300x100}</w:t>
+      </w:r>
+    </w:p>
+    <w:p>
+      <w:pPr>
+        <w:pStyle w:val="Normal"/>
+        <w:numPr>
+          <w:ilvl w:val="0"/>
+          <w:numId w:val="1"/>
+        </w:numPr>
+        <w:jc w:val="center"/>
+        <w:rPr/>
+      </w:pPr>
+      <w:r>
+        <w:rPr/>
+        <w:t>${/logo_block}</w:t>
       </w:r>
     </w:p>
     <w:p>
@@ -863,15 +893,7 @@
       </w:pPr>
       <w:r>
         <w:rPr/>
-        <w:t>${</w:t>
-      </w:r>
-      <w:r>
-        <w:rPr/>
-        <w:t>ecosites</w:t>
-      </w:r>
-      <w:r>
-        <w:rPr/>
-        <w:t>}</w:t>
+        <w:t>${ecosites}</w:t>
       </w:r>
     </w:p>
     <w:p>
@@ -881,11 +903,7 @@
       </w:pPr>
       <w:r>
         <w:rPr/>
-        <w:t xml:space="preserve">Ecosite: </w:t>
-      </w:r>
-      <w:r>
-        <w:rPr/>
-        <w:t>${ecosite_name}</w:t>
+        <w:t>Ecosite: ${ecosite_name}</w:t>
       </w:r>
     </w:p>
     <w:p>
@@ -1095,15 +1113,7 @@
       </w:pPr>
       <w:r>
         <w:rPr/>
-        <w:t>${/</w:t>
-      </w:r>
-      <w:r>
-        <w:rPr/>
-        <w:t>ecosites</w:t>
-      </w:r>
-      <w:r>
-        <w:rPr/>
-        <w:t>}</w:t>
+        <w:t>${/ecosites}</w:t>
       </w:r>
     </w:p>
     <w:sectPr>

</xml_diff>

<commit_message>
Add practice benefits to generated document #59
</commit_message>
<xml_diff>
--- a/templates/rcp-template.docx
+++ b/templates/rcp-template.docx
@@ -1091,6 +1091,106 @@
       <w:r>
         <w:rPr/>
         <w:t xml:space="preserve"> ${practice_overview}</w:t>
+      </w:r>
+    </w:p>
+    <w:p>
+      <w:pPr>
+        <w:pStyle w:val="TextBody"/>
+        <w:rPr>
+          <w:b/>
+          <w:b/>
+          <w:bCs/>
+        </w:rPr>
+      </w:pPr>
+      <w:r>
+        <w:rPr>
+          <w:b/>
+          <w:bCs/>
+        </w:rPr>
+        <w:t>Benefits:</w:t>
+      </w:r>
+    </w:p>
+    <w:p>
+      <w:pPr>
+        <w:pStyle w:val="TextBody"/>
+        <w:rPr>
+          <w:b w:val="false"/>
+          <w:b w:val="false"/>
+          <w:bCs w:val="false"/>
+        </w:rPr>
+      </w:pPr>
+      <w:r>
+        <w:rPr>
+          <w:b w:val="false"/>
+          <w:bCs w:val="false"/>
+        </w:rPr>
+        <w:t>${</w:t>
+      </w:r>
+      <w:r>
+        <w:rPr>
+          <w:b w:val="false"/>
+          <w:bCs w:val="false"/>
+        </w:rPr>
+        <w:t>practice_</w:t>
+      </w:r>
+      <w:r>
+        <w:rPr>
+          <w:b w:val="false"/>
+          <w:bCs w:val="false"/>
+        </w:rPr>
+        <w:t>benefits}</w:t>
+      </w:r>
+    </w:p>
+    <w:p>
+      <w:pPr>
+        <w:pStyle w:val="TextBody"/>
+        <w:numPr>
+          <w:ilvl w:val="0"/>
+          <w:numId w:val="6"/>
+        </w:numPr>
+        <w:rPr>
+          <w:b w:val="false"/>
+          <w:b w:val="false"/>
+          <w:bCs w:val="false"/>
+        </w:rPr>
+      </w:pPr>
+      <w:r>
+        <w:rPr>
+          <w:b w:val="false"/>
+          <w:bCs w:val="false"/>
+        </w:rPr>
+        <w:t>${item}</w:t>
+      </w:r>
+    </w:p>
+    <w:p>
+      <w:pPr>
+        <w:pStyle w:val="TextBody"/>
+        <w:rPr>
+          <w:b w:val="false"/>
+          <w:b w:val="false"/>
+          <w:bCs w:val="false"/>
+        </w:rPr>
+      </w:pPr>
+      <w:r>
+        <w:rPr>
+          <w:b w:val="false"/>
+          <w:bCs w:val="false"/>
+        </w:rPr>
+        <w:t>${/</w:t>
+      </w:r>
+      <w:r>
+        <w:rPr>
+          <w:b w:val="false"/>
+          <w:bCs w:val="false"/>
+        </w:rPr>
+        <w:t>practice_</w:t>
+      </w:r>
+      <w:r>
+        <w:rPr>
+          <w:b w:val="false"/>
+          <w:bCs w:val="false"/>
+        </w:rPr>
+        <w:t>benefits}</w:t>
       </w:r>
     </w:p>
     <w:p>
@@ -1809,6 +1909,143 @@
       </w:rPr>
     </w:lvl>
   </w:abstractNum>
+  <w:abstractNum w:abstractNumId="6">
+    <w:lvl w:ilvl="0">
+      <w:start w:val="1"/>
+      <w:numFmt w:val="bullet"/>
+      <w:lvlText w:val=""/>
+      <w:lvlJc w:val="start"/>
+      <w:pPr>
+        <w:tabs>
+          <w:tab w:val="num" w:pos="720"/>
+        </w:tabs>
+        <w:ind w:start="720" w:hanging="360"/>
+      </w:pPr>
+      <w:rPr>
+        <w:rFonts w:ascii="Symbol" w:hAnsi="Symbol" w:cs="Symbol" w:hint="default"/>
+      </w:rPr>
+    </w:lvl>
+    <w:lvl w:ilvl="1">
+      <w:start w:val="1"/>
+      <w:numFmt w:val="bullet"/>
+      <w:lvlText w:val="◦"/>
+      <w:lvlJc w:val="start"/>
+      <w:pPr>
+        <w:tabs>
+          <w:tab w:val="num" w:pos="1080"/>
+        </w:tabs>
+        <w:ind w:start="1080" w:hanging="360"/>
+      </w:pPr>
+      <w:rPr>
+        <w:rFonts w:ascii="OpenSymbol" w:hAnsi="OpenSymbol" w:cs="OpenSymbol" w:hint="default"/>
+      </w:rPr>
+    </w:lvl>
+    <w:lvl w:ilvl="2">
+      <w:start w:val="1"/>
+      <w:numFmt w:val="bullet"/>
+      <w:lvlText w:val="▪"/>
+      <w:lvlJc w:val="start"/>
+      <w:pPr>
+        <w:tabs>
+          <w:tab w:val="num" w:pos="1440"/>
+        </w:tabs>
+        <w:ind w:start="1440" w:hanging="360"/>
+      </w:pPr>
+      <w:rPr>
+        <w:rFonts w:ascii="OpenSymbol" w:hAnsi="OpenSymbol" w:cs="OpenSymbol" w:hint="default"/>
+      </w:rPr>
+    </w:lvl>
+    <w:lvl w:ilvl="3">
+      <w:start w:val="1"/>
+      <w:numFmt w:val="bullet"/>
+      <w:lvlText w:val=""/>
+      <w:lvlJc w:val="start"/>
+      <w:pPr>
+        <w:tabs>
+          <w:tab w:val="num" w:pos="1800"/>
+        </w:tabs>
+        <w:ind w:start="1800" w:hanging="360"/>
+      </w:pPr>
+      <w:rPr>
+        <w:rFonts w:ascii="Symbol" w:hAnsi="Symbol" w:cs="Symbol" w:hint="default"/>
+      </w:rPr>
+    </w:lvl>
+    <w:lvl w:ilvl="4">
+      <w:start w:val="1"/>
+      <w:numFmt w:val="bullet"/>
+      <w:lvlText w:val="◦"/>
+      <w:lvlJc w:val="start"/>
+      <w:pPr>
+        <w:tabs>
+          <w:tab w:val="num" w:pos="2160"/>
+        </w:tabs>
+        <w:ind w:start="2160" w:hanging="360"/>
+      </w:pPr>
+      <w:rPr>
+        <w:rFonts w:ascii="OpenSymbol" w:hAnsi="OpenSymbol" w:cs="OpenSymbol" w:hint="default"/>
+      </w:rPr>
+    </w:lvl>
+    <w:lvl w:ilvl="5">
+      <w:start w:val="1"/>
+      <w:numFmt w:val="bullet"/>
+      <w:lvlText w:val="▪"/>
+      <w:lvlJc w:val="start"/>
+      <w:pPr>
+        <w:tabs>
+          <w:tab w:val="num" w:pos="2520"/>
+        </w:tabs>
+        <w:ind w:start="2520" w:hanging="360"/>
+      </w:pPr>
+      <w:rPr>
+        <w:rFonts w:ascii="OpenSymbol" w:hAnsi="OpenSymbol" w:cs="OpenSymbol" w:hint="default"/>
+      </w:rPr>
+    </w:lvl>
+    <w:lvl w:ilvl="6">
+      <w:start w:val="1"/>
+      <w:numFmt w:val="bullet"/>
+      <w:lvlText w:val=""/>
+      <w:lvlJc w:val="start"/>
+      <w:pPr>
+        <w:tabs>
+          <w:tab w:val="num" w:pos="2880"/>
+        </w:tabs>
+        <w:ind w:start="2880" w:hanging="360"/>
+      </w:pPr>
+      <w:rPr>
+        <w:rFonts w:ascii="Symbol" w:hAnsi="Symbol" w:cs="Symbol" w:hint="default"/>
+      </w:rPr>
+    </w:lvl>
+    <w:lvl w:ilvl="7">
+      <w:start w:val="1"/>
+      <w:numFmt w:val="bullet"/>
+      <w:lvlText w:val="◦"/>
+      <w:lvlJc w:val="start"/>
+      <w:pPr>
+        <w:tabs>
+          <w:tab w:val="num" w:pos="3240"/>
+        </w:tabs>
+        <w:ind w:start="3240" w:hanging="360"/>
+      </w:pPr>
+      <w:rPr>
+        <w:rFonts w:ascii="OpenSymbol" w:hAnsi="OpenSymbol" w:cs="OpenSymbol" w:hint="default"/>
+      </w:rPr>
+    </w:lvl>
+    <w:lvl w:ilvl="8">
+      <w:start w:val="1"/>
+      <w:numFmt w:val="bullet"/>
+      <w:lvlText w:val="▪"/>
+      <w:lvlJc w:val="start"/>
+      <w:pPr>
+        <w:tabs>
+          <w:tab w:val="num" w:pos="3600"/>
+        </w:tabs>
+        <w:ind w:start="3600" w:hanging="360"/>
+      </w:pPr>
+      <w:rPr>
+        <w:rFonts w:ascii="OpenSymbol" w:hAnsi="OpenSymbol" w:cs="OpenSymbol" w:hint="default"/>
+      </w:rPr>
+    </w:lvl>
+  </w:abstractNum>
   <w:num w:numId="1">
     <w:abstractNumId w:val="1"/>
   </w:num>
@@ -1823,6 +2060,9 @@
   </w:num>
   <w:num w:numId="5">
     <w:abstractNumId w:val="5"/>
+  </w:num>
+  <w:num w:numId="6">
+    <w:abstractNumId w:val="6"/>
   </w:num>
 </w:numbering>
 </file>

</xml_diff>

<commit_message>
Add links to practice resources #62
</commit_message>
<xml_diff>
--- a/templates/rcp-template.docx
+++ b/templates/rcp-template.docx
@@ -1124,21 +1124,7 @@
           <w:b w:val="false"/>
           <w:bCs w:val="false"/>
         </w:rPr>
-        <w:t>${</w:t>
-      </w:r>
-      <w:r>
-        <w:rPr>
-          <w:b w:val="false"/>
-          <w:bCs w:val="false"/>
-        </w:rPr>
-        <w:t>practice_</w:t>
-      </w:r>
-      <w:r>
-        <w:rPr>
-          <w:b w:val="false"/>
-          <w:bCs w:val="false"/>
-        </w:rPr>
-        <w:t>benefits}</w:t>
+        <w:t>${practice_benefits}</w:t>
       </w:r>
     </w:p>
     <w:p>
@@ -1176,21 +1162,75 @@
           <w:b w:val="false"/>
           <w:bCs w:val="false"/>
         </w:rPr>
-        <w:t>${/</w:t>
-      </w:r>
-      <w:r>
-        <w:rPr>
+        <w:t>${/practice_benefits}</w:t>
+      </w:r>
+    </w:p>
+    <w:p>
+      <w:pPr>
+        <w:pStyle w:val="TextBody"/>
+        <w:rPr>
+          <w:b/>
+          <w:b/>
+          <w:bCs/>
+        </w:rPr>
+      </w:pPr>
+      <w:r>
+        <w:rPr>
+          <w:b/>
+          <w:bCs/>
+        </w:rPr>
+        <w:t>Resources:</w:t>
+      </w:r>
+    </w:p>
+    <w:p>
+      <w:pPr>
+        <w:pStyle w:val="TextBody"/>
+        <w:rPr>
+          <w:b w:val="false"/>
           <w:b w:val="false"/>
           <w:bCs w:val="false"/>
         </w:rPr>
-        <w:t>practice_</w:t>
-      </w:r>
+      </w:pPr>
       <w:r>
         <w:rPr>
           <w:b w:val="false"/>
           <w:bCs w:val="false"/>
         </w:rPr>
-        <w:t>benefits}</w:t>
+        <w:t>${practice_resources}</w:t>
+      </w:r>
+    </w:p>
+    <w:p>
+      <w:pPr>
+        <w:pStyle w:val="TextBody"/>
+        <w:numPr>
+          <w:ilvl w:val="0"/>
+          <w:numId w:val="6"/>
+        </w:numPr>
+        <w:rPr/>
+      </w:pPr>
+      <w:r>
+        <w:rPr>
+          <w:b w:val="false"/>
+          <w:bCs w:val="false"/>
+        </w:rPr>
+        <w:t>${item}</w:t>
+      </w:r>
+    </w:p>
+    <w:p>
+      <w:pPr>
+        <w:pStyle w:val="TextBody"/>
+        <w:rPr>
+          <w:b w:val="false"/>
+          <w:b w:val="false"/>
+          <w:bCs w:val="false"/>
+        </w:rPr>
+      </w:pPr>
+      <w:r>
+        <w:rPr>
+          <w:b w:val="false"/>
+          <w:bCs w:val="false"/>
+        </w:rPr>
+        <w:t>${/practice_resources}</w:t>
       </w:r>
     </w:p>
     <w:p>
@@ -2203,6 +2243,13 @@
     <w:qFormat/>
     <w:rPr>
       <w:rFonts w:ascii="Liberation Mono" w:hAnsi="Liberation Mono" w:eastAsia="Liberation Mono" w:cs="Liberation Mono"/>
+    </w:rPr>
+  </w:style>
+  <w:style w:type="character" w:styleId="InternetLink">
+    <w:name w:val="Hyperlink"/>
+    <w:rPr>
+      <w:color w:val="000080"/>
+      <w:u w:val="single"/>
     </w:rPr>
   </w:style>
   <w:style w:type="paragraph" w:styleId="Heading">

</xml_diff>

<commit_message>
Change "Native wildlife" to "Wildlife".
Per Eli's suggestion in #67.
</commit_message>
<xml_diff>
--- a/templates/rcp-template.docx
+++ b/templates/rcp-template.docx
@@ -817,37 +817,37 @@
       </w:pPr>
       <w:r>
         <w:rPr/>
-        <w:t>Native Wildlife</w:t>
-      </w:r>
-    </w:p>
-    <w:p>
-      <w:pPr>
-        <w:pStyle w:val="TextBody"/>
-        <w:bidi w:val="0"/>
-        <w:jc w:val="start"/>
-        <w:rPr>
-          <w:b/>
-          <w:b/>
-          <w:bCs/>
-        </w:rPr>
-      </w:pPr>
-      <w:r>
-        <w:rPr>
-          <w:b/>
-          <w:bCs/>
-        </w:rPr>
-      </w:r>
-    </w:p>
-    <w:p>
-      <w:pPr>
-        <w:pStyle w:val="TextBody"/>
-        <w:bidi w:val="0"/>
-        <w:jc w:val="start"/>
-        <w:rPr/>
-      </w:pPr>
-      <w:r>
-        <w:rPr/>
-        <w:t>${native_wildlife}</w:t>
+        <w:t>Wildlife</w:t>
+      </w:r>
+    </w:p>
+    <w:p>
+      <w:pPr>
+        <w:pStyle w:val="TextBody"/>
+        <w:bidi w:val="0"/>
+        <w:jc w:val="start"/>
+        <w:rPr>
+          <w:b/>
+          <w:b/>
+          <w:bCs/>
+        </w:rPr>
+      </w:pPr>
+      <w:r>
+        <w:rPr>
+          <w:b/>
+          <w:bCs/>
+        </w:rPr>
+      </w:r>
+    </w:p>
+    <w:p>
+      <w:pPr>
+        <w:pStyle w:val="TextBody"/>
+        <w:bidi w:val="0"/>
+        <w:jc w:val="start"/>
+        <w:rPr/>
+      </w:pPr>
+      <w:r>
+        <w:rPr/>
+        <w:t>${wildlife}</w:t>
       </w:r>
     </w:p>
     <w:p>

</xml_diff>

<commit_message>
Rename "ecosites" to "land use areas" #69
</commit_message>
<xml_diff>
--- a/templates/rcp-template.docx
+++ b/templates/rcp-template.docx
@@ -893,7 +893,7 @@
       </w:pPr>
       <w:r>
         <w:rPr/>
-        <w:t>${ecosites}</w:t>
+        <w:t>${locations}</w:t>
       </w:r>
     </w:p>
     <w:p>
@@ -903,7 +903,11 @@
       </w:pPr>
       <w:r>
         <w:rPr/>
-        <w:t>Ecosite: ${ecosite_name}</w:t>
+        <w:t>Land use area</w:t>
+      </w:r>
+      <w:r>
+        <w:rPr/>
+        <w:t>: ${location_name}</w:t>
       </w:r>
     </w:p>
     <w:p>
@@ -1006,47 +1010,47 @@
           <w:b/>
           <w:bCs/>
         </w:rPr>
-        <w:t>Ecosite type:</w:t>
-      </w:r>
-      <w:r>
-        <w:rPr/>
-        <w:t xml:space="preserve"> ${ecosite_type}</w:t>
-      </w:r>
-    </w:p>
-    <w:p>
-      <w:pPr>
-        <w:pStyle w:val="TextBody"/>
-        <w:rPr/>
-      </w:pPr>
-      <w:r>
-        <w:rPr>
-          <w:b/>
-          <w:bCs/>
-        </w:rPr>
-        <w:t>Ecosite overview:</w:t>
-      </w:r>
-      <w:r>
-        <w:rPr/>
-        <w:t xml:space="preserve"> ${ecosite_overview}</w:t>
-      </w:r>
-    </w:p>
-    <w:p>
-      <w:pPr>
-        <w:pStyle w:val="TextBody"/>
-        <w:rPr/>
-      </w:pPr>
-      <w:r>
-        <w:rPr/>
-      </w:r>
-    </w:p>
-    <w:p>
-      <w:pPr>
-        <w:pStyle w:val="TextBody"/>
-        <w:rPr/>
-      </w:pPr>
-      <w:r>
-        <w:rPr/>
-        <w:t>${ecosite_practices}</w:t>
+        <w:t>Location type:</w:t>
+      </w:r>
+      <w:r>
+        <w:rPr/>
+        <w:t xml:space="preserve"> ${location_type}</w:t>
+      </w:r>
+    </w:p>
+    <w:p>
+      <w:pPr>
+        <w:pStyle w:val="TextBody"/>
+        <w:rPr/>
+      </w:pPr>
+      <w:r>
+        <w:rPr>
+          <w:b/>
+          <w:bCs/>
+        </w:rPr>
+        <w:t>Location overview:</w:t>
+      </w:r>
+      <w:r>
+        <w:rPr/>
+        <w:t xml:space="preserve"> ${location_overview}</w:t>
+      </w:r>
+    </w:p>
+    <w:p>
+      <w:pPr>
+        <w:pStyle w:val="TextBody"/>
+        <w:rPr/>
+      </w:pPr>
+      <w:r>
+        <w:rPr/>
+      </w:r>
+    </w:p>
+    <w:p>
+      <w:pPr>
+        <w:pStyle w:val="TextBody"/>
+        <w:rPr/>
+      </w:pPr>
+      <w:r>
+        <w:rPr/>
+        <w:t>${location_practices}</w:t>
       </w:r>
     </w:p>
     <w:p>
@@ -1240,7 +1244,7 @@
       </w:pPr>
       <w:r>
         <w:rPr/>
-        <w:t>${/ecosite_practices}</w:t>
+        <w:t>${/location_practices}</w:t>
       </w:r>
     </w:p>
     <w:p>
@@ -1253,7 +1257,7 @@
       </w:pPr>
       <w:r>
         <w:rPr/>
-        <w:t>${/ecosites}</w:t>
+        <w:t>${/locations}</w:t>
       </w:r>
     </w:p>
     <w:sectPr>

</xml_diff>

<commit_message>
Test for more template string replacements #114
</commit_message>
<xml_diff>
--- a/templates/rcp-template.docx
+++ b/templates/rcp-template.docx
@@ -903,11 +903,7 @@
       </w:pPr>
       <w:r>
         <w:rPr/>
-        <w:t>Land use area</w:t>
-      </w:r>
-      <w:r>
-        <w:rPr/>
-        <w:t>: ${location_name}</w:t>
+        <w:t>Land use area: ${location_name}</w:t>
       </w:r>
     </w:p>
     <w:p>

</xml_diff>

<commit_message>
Remove stray period prepended to numbered outline list items in RCP template #121
</commit_message>
<xml_diff>
--- a/templates/rcp-template.docx
+++ b/templates/rcp-template.docx
@@ -5,10 +5,6 @@
     <w:p>
       <w:pPr>
         <w:pStyle w:val="Normal"/>
-        <w:numPr>
-          <w:ilvl w:val="0"/>
-          <w:numId w:val="1"/>
-        </w:numPr>
         <w:jc w:val="center"/>
         <w:rPr/>
       </w:pPr>
@@ -20,10 +16,6 @@
     <w:p>
       <w:pPr>
         <w:pStyle w:val="Normal"/>
-        <w:numPr>
-          <w:ilvl w:val="0"/>
-          <w:numId w:val="1"/>
-        </w:numPr>
         <w:jc w:val="center"/>
         <w:rPr/>
       </w:pPr>
@@ -35,10 +27,6 @@
     <w:p>
       <w:pPr>
         <w:pStyle w:val="Normal"/>
-        <w:numPr>
-          <w:ilvl w:val="0"/>
-          <w:numId w:val="1"/>
-        </w:numPr>
         <w:jc w:val="center"/>
         <w:rPr/>
       </w:pPr>
@@ -49,34 +37,29 @@
     </w:p>
     <w:p>
       <w:pPr>
+        <w:pStyle w:val="Title"/>
+        <w:rPr/>
+      </w:pPr>
+      <w:r>
+        <w:rPr/>
+        <w:t>Resource Conservation Plan</w:t>
+      </w:r>
+    </w:p>
+    <w:p>
+      <w:pPr>
+        <w:pStyle w:val="TextBody"/>
+        <w:bidi w:val="0"/>
+        <w:spacing w:before="240" w:after="120"/>
+        <w:jc w:val="start"/>
+        <w:rPr/>
+      </w:pPr>
+      <w:r>
+        <w:rPr/>
+      </w:r>
+    </w:p>
+    <w:p>
+      <w:pPr>
         <w:pStyle w:val="Heading1"/>
-        <w:bidi w:val="0"/>
-        <w:spacing w:before="240" w:after="120"/>
-        <w:jc w:val="start"/>
-        <w:rPr/>
-      </w:pPr>
-      <w:r>
-        <w:rPr/>
-        <w:t>Resource Conservation Plan</w:t>
-      </w:r>
-    </w:p>
-    <w:p>
-      <w:pPr>
-        <w:pStyle w:val="TextBody"/>
-        <w:bidi w:val="0"/>
-        <w:spacing w:before="240" w:after="120"/>
-        <w:jc w:val="start"/>
-        <w:rPr/>
-      </w:pPr>
-      <w:r>
-        <w:rPr/>
-      </w:r>
-    </w:p>
-    <w:p>
-      <w:pPr>
-        <w:pStyle w:val="Heading2"/>
-        <w:bidi w:val="0"/>
-        <w:jc w:val="start"/>
         <w:rPr/>
       </w:pPr>
       <w:r>
@@ -340,9 +323,7 @@
     </w:p>
     <w:p>
       <w:pPr>
-        <w:pStyle w:val="Heading3"/>
-        <w:bidi w:val="0"/>
-        <w:jc w:val="start"/>
+        <w:pStyle w:val="Heading2"/>
         <w:rPr/>
       </w:pPr>
       <w:r>
@@ -414,9 +395,7 @@
     </w:p>
     <w:p>
       <w:pPr>
-        <w:pStyle w:val="Heading3"/>
-        <w:bidi w:val="0"/>
-        <w:jc w:val="start"/>
+        <w:pStyle w:val="Heading2"/>
         <w:rPr/>
       </w:pPr>
       <w:r>
@@ -488,9 +467,7 @@
     </w:p>
     <w:p>
       <w:pPr>
-        <w:pStyle w:val="Heading3"/>
-        <w:bidi w:val="0"/>
-        <w:jc w:val="start"/>
+        <w:pStyle w:val="Heading2"/>
         <w:rPr/>
       </w:pPr>
       <w:r>
@@ -698,9 +675,7 @@
     </w:p>
     <w:p>
       <w:pPr>
-        <w:pStyle w:val="Heading3"/>
-        <w:bidi w:val="0"/>
-        <w:jc w:val="start"/>
+        <w:pStyle w:val="Heading2"/>
         <w:rPr/>
       </w:pPr>
       <w:r>
@@ -810,9 +785,7 @@
     </w:p>
     <w:p>
       <w:pPr>
-        <w:pStyle w:val="Heading3"/>
-        <w:bidi w:val="0"/>
-        <w:jc w:val="start"/>
+        <w:pStyle w:val="Heading2"/>
         <w:rPr/>
       </w:pPr>
       <w:r>
@@ -863,42 +836,42 @@
     </w:p>
     <w:p>
       <w:pPr>
+        <w:pStyle w:val="Heading1"/>
+        <w:rPr/>
+      </w:pPr>
+      <w:bookmarkStart w:id="0" w:name="__DdeLink__3673_412721526"/>
+      <w:r>
+        <w:rPr/>
+        <w:t>Sustainable Practices – Detailed Recommendations</w:t>
+      </w:r>
+      <w:bookmarkEnd w:id="0"/>
+    </w:p>
+    <w:p>
+      <w:pPr>
+        <w:pStyle w:val="TextBody"/>
+        <w:bidi w:val="0"/>
+        <w:jc w:val="start"/>
+        <w:rPr/>
+      </w:pPr>
+      <w:r>
+        <w:rPr/>
+      </w:r>
+    </w:p>
+    <w:p>
+      <w:pPr>
+        <w:pStyle w:val="TextBody"/>
+        <w:bidi w:val="0"/>
+        <w:jc w:val="start"/>
+        <w:rPr/>
+      </w:pPr>
+      <w:r>
+        <w:rPr/>
+        <w:t>${locations}</w:t>
+      </w:r>
+    </w:p>
+    <w:p>
+      <w:pPr>
         <w:pStyle w:val="Heading2"/>
-        <w:rPr/>
-      </w:pPr>
-      <w:bookmarkStart w:id="0" w:name="__DdeLink__3673_412721526"/>
-      <w:r>
-        <w:rPr/>
-        <w:t>Sustainable Practices – Detailed Recommendations</w:t>
-      </w:r>
-      <w:bookmarkEnd w:id="0"/>
-    </w:p>
-    <w:p>
-      <w:pPr>
-        <w:pStyle w:val="TextBody"/>
-        <w:bidi w:val="0"/>
-        <w:jc w:val="start"/>
-        <w:rPr/>
-      </w:pPr>
-      <w:r>
-        <w:rPr/>
-      </w:r>
-    </w:p>
-    <w:p>
-      <w:pPr>
-        <w:pStyle w:val="TextBody"/>
-        <w:bidi w:val="0"/>
-        <w:jc w:val="start"/>
-        <w:rPr/>
-      </w:pPr>
-      <w:r>
-        <w:rPr/>
-        <w:t>${locations}</w:t>
-      </w:r>
-    </w:p>
-    <w:p>
-      <w:pPr>
-        <w:pStyle w:val="Heading3"/>
         <w:rPr/>
       </w:pPr>
       <w:r>
@@ -1051,7 +1024,7 @@
     </w:p>
     <w:p>
       <w:pPr>
-        <w:pStyle w:val="Heading4"/>
+        <w:pStyle w:val="Heading3"/>
         <w:rPr/>
       </w:pPr>
       <w:r>
@@ -1292,37 +1265,38 @@
     <w:lvl w:ilvl="0">
       <w:start w:val="1"/>
       <w:pStyle w:val="Heading1"/>
+      <w:numFmt w:val="decimal"/>
+      <w:suff w:val="nothing"/>
+      <w:lvlText w:val="%1. "/>
+      <w:lvlJc w:val="start"/>
+      <w:pPr>
+        <w:tabs>
+          <w:tab w:val="num" w:pos="0"/>
+        </w:tabs>
+        <w:ind w:start="0" w:hanging="0"/>
+      </w:pPr>
+      <w:rPr/>
+    </w:lvl>
+    <w:lvl w:ilvl="1">
+      <w:start w:val="1"/>
+      <w:pStyle w:val="Heading2"/>
+      <w:numFmt w:val="decimal"/>
+      <w:lvlText w:val="%1.%2. "/>
+      <w:lvlJc w:val="start"/>
+      <w:pPr>
+        <w:tabs>
+          <w:tab w:val="num" w:pos="0"/>
+        </w:tabs>
+        <w:ind w:start="0" w:hanging="0"/>
+      </w:pPr>
+      <w:rPr/>
+    </w:lvl>
+    <w:lvl w:ilvl="2">
+      <w:start w:val="1"/>
+      <w:pStyle w:val="Heading3"/>
       <w:numFmt w:val="none"/>
       <w:suff w:val="nothing"/>
-      <w:lvlText w:val=""/>
-      <w:lvlJc w:val="start"/>
-      <w:pPr>
-        <w:tabs>
-          <w:tab w:val="num" w:pos="0"/>
-        </w:tabs>
-        <w:ind w:start="0" w:hanging="0"/>
-      </w:pPr>
-      <w:rPr/>
-    </w:lvl>
-    <w:lvl w:ilvl="1">
-      <w:start w:val="1"/>
-      <w:pStyle w:val="Heading2"/>
-      <w:numFmt w:val="decimal"/>
-      <w:lvlText w:val="%1.%2."/>
-      <w:lvlJc w:val="start"/>
-      <w:pPr>
-        <w:tabs>
-          <w:tab w:val="num" w:pos="0"/>
-        </w:tabs>
-        <w:ind w:start="0" w:hanging="0"/>
-      </w:pPr>
-      <w:rPr/>
-    </w:lvl>
-    <w:lvl w:ilvl="2">
-      <w:start w:val="1"/>
-      <w:pStyle w:val="Heading3"/>
-      <w:numFmt w:val="decimal"/>
-      <w:lvlText w:val="%1.%2.%3."/>
+      <w:lvlText w:val="%1.%2.%3"/>
       <w:lvlJc w:val="start"/>
       <w:pPr>
         <w:tabs>
@@ -1337,7 +1311,7 @@
       <w:pStyle w:val="Heading4"/>
       <w:numFmt w:val="none"/>
       <w:suff w:val="nothing"/>
-      <w:lvlText w:val=""/>
+      <w:lvlText w:val="%1.%2.%3.%4"/>
       <w:lvlJc w:val="start"/>
       <w:pPr>
         <w:tabs>
@@ -1351,7 +1325,7 @@
       <w:start w:val="1"/>
       <w:numFmt w:val="none"/>
       <w:suff w:val="nothing"/>
-      <w:lvlText w:val=""/>
+      <w:lvlText w:val="%1.%2.%3.%4.%5"/>
       <w:lvlJc w:val="start"/>
       <w:pPr>
         <w:tabs>
@@ -1365,7 +1339,7 @@
       <w:start w:val="1"/>
       <w:numFmt w:val="none"/>
       <w:suff w:val="nothing"/>
-      <w:lvlText w:val=""/>
+      <w:lvlText w:val="%1.%2.%3.%4.%5.%6"/>
       <w:lvlJc w:val="start"/>
       <w:pPr>
         <w:tabs>
@@ -1379,7 +1353,7 @@
       <w:start w:val="1"/>
       <w:numFmt w:val="none"/>
       <w:suff w:val="nothing"/>
-      <w:lvlText w:val=""/>
+      <w:lvlText w:val="%1.%2.%3.%4.%5.%6.%7"/>
       <w:lvlJc w:val="start"/>
       <w:pPr>
         <w:tabs>
@@ -1393,7 +1367,7 @@
       <w:start w:val="1"/>
       <w:numFmt w:val="none"/>
       <w:suff w:val="nothing"/>
-      <w:lvlText w:val=""/>
+      <w:lvlText w:val="%1.%2.%3.%4.%5.%6.%7.%8"/>
       <w:lvlJc w:val="start"/>
       <w:pPr>
         <w:tabs>
@@ -1407,7 +1381,7 @@
       <w:start w:val="1"/>
       <w:numFmt w:val="none"/>
       <w:suff w:val="nothing"/>
-      <w:lvlText w:val=""/>
+      <w:lvlText w:val="%1.%2.%3.%4.%5.%6.%7.%8.%9"/>
       <w:lvlJc w:val="start"/>
       <w:pPr>
         <w:tabs>
@@ -2367,11 +2341,11 @@
     <w:next w:val="TextBody"/>
     <w:qFormat/>
     <w:pPr>
-      <w:jc w:val="center"/>
+      <w:jc w:val="start"/>
     </w:pPr>
     <w:rPr>
       <w:b/>
-      <w:bCs/>
+      <w:bCs w:val="false"/>
       <w:sz w:val="56"/>
       <w:szCs w:val="56"/>
     </w:rPr>
@@ -2393,5 +2367,19 @@
       <w:szCs w:val="12"/>
     </w:rPr>
   </w:style>
+  <w:style w:type="paragraph" w:styleId="Subtitle">
+    <w:name w:val="Subtitle"/>
+    <w:basedOn w:val="Heading"/>
+    <w:next w:val="TextBody"/>
+    <w:qFormat/>
+    <w:pPr>
+      <w:spacing w:before="60" w:after="120"/>
+      <w:jc w:val="start"/>
+    </w:pPr>
+    <w:rPr>
+      <w:sz w:val="36"/>
+      <w:szCs w:val="36"/>
+    </w:rPr>
+  </w:style>
 </w:styles>
 </file>
</xml_diff>